<commit_message>
Auto Daily 8:00 PM Dashboard Update [2026-10-27 20:00]
</commit_message>
<xml_diff>
--- a/docs/weekly/2026-W44_當週執行率回顧報告.docx
+++ b/docs/weekly/2026-W44_當週執行率回顧報告.docx
@@ -21,7 +21,7 @@
           <w:color w:val="555555"/>
           <w:sz w:val="20"/>
         </w:rPr>
-        <w:t>週期：2026/10/26–2026/11/01　｜　整體時間執行率：0.0%</w:t>
+        <w:t>週期：2026/10/26–2026/11/01　｜　整體時間執行率：24.2%</w:t>
       </w:r>
     </w:p>
     <w:p>
@@ -783,7 +783,7 @@
                 <w:color w:val="000000"/>
                 <w:sz w:val="19"/>
               </w:rPr>
-              <w:t>0.00 hr</w:t>
+              <w:t>0.98 hr</w:t>
             </w:r>
           </w:p>
         </w:tc>
@@ -810,7 +810,7 @@
                 <w:color w:val="000000"/>
                 <w:sz w:val="19"/>
               </w:rPr>
-              <w:t>0.0%</w:t>
+              <w:t>59.6%</w:t>
             </w:r>
           </w:p>
         </w:tc>
@@ -864,7 +864,7 @@
                 <w:color w:val="000000"/>
                 <w:sz w:val="19"/>
               </w:rPr>
-              <w:t>0.00 km</w:t>
+              <w:t>8.40 km</w:t>
             </w:r>
           </w:p>
         </w:tc>
@@ -891,7 +891,7 @@
                 <w:color w:val="000000"/>
                 <w:sz w:val="19"/>
               </w:rPr>
-              <w:t>0.0%</w:t>
+              <w:t>102.7%</w:t>
             </w:r>
           </w:p>
         </w:tc>
@@ -1631,7 +1631,7 @@
                 <w:color w:val="000000"/>
                 <w:sz w:val="19"/>
               </w:rPr>
-              <w:t>0分</w:t>
+              <w:t>59分 / 8.40km</w:t>
             </w:r>
           </w:p>
         </w:tc>
@@ -1658,7 +1658,7 @@
                 <w:color w:val="000000"/>
                 <w:sz w:val="19"/>
               </w:rPr>
-              <w:t>❌ 未執行/待排程</w:t>
+              <w:t>🟢 良好達標 (86%, A-)</w:t>
             </w:r>
           </w:p>
         </w:tc>
@@ -3013,7 +3013,7 @@
     </w:p>
     <w:p>
       <w:r>
-        <w:t>• 當週累積自行車 0.00 km、跑步 0.00 km、游泳 0.00 km，整體時間執行率達 0.0%。</w:t>
+        <w:t>• 當週累積自行車 0.00 km、跑步 8.40 km、游泳 0.00 km，整體時間執行率達 24.2%。</w:t>
         <w:br/>
       </w:r>
       <w:r>

</xml_diff>

<commit_message>
Auto Daily 8:00 PM Dashboard Update [2026-10-28 20:00]
</commit_message>
<xml_diff>
--- a/docs/weekly/2026-W44_當週執行率回顧報告.docx
+++ b/docs/weekly/2026-W44_當週執行率回顧報告.docx
@@ -21,7 +21,7 @@
           <w:color w:val="555555"/>
           <w:sz w:val="20"/>
         </w:rPr>
-        <w:t>週期：2026/10/26–2026/11/01　｜　整體時間執行率：24.2%</w:t>
+        <w:t>週期：2026/10/26–2026/11/01　｜　整體時間執行率：44.7%</w:t>
       </w:r>
     </w:p>
     <w:p>
@@ -347,7 +347,7 @@
                 <w:color w:val="000000"/>
                 <w:sz w:val="19"/>
               </w:rPr>
-              <w:t>0.00 hr</w:t>
+              <w:t>0.83 hr</w:t>
             </w:r>
           </w:p>
         </w:tc>
@@ -374,7 +374,7 @@
                 <w:color w:val="000000"/>
                 <w:sz w:val="19"/>
               </w:rPr>
-              <w:t>0.0%</w:t>
+              <w:t>62.5%</w:t>
             </w:r>
           </w:p>
         </w:tc>
@@ -428,7 +428,7 @@
                 <w:color w:val="000000"/>
                 <w:sz w:val="19"/>
               </w:rPr>
-              <w:t>0.00 km</w:t>
+              <w:t>2.75 km</w:t>
             </w:r>
           </w:p>
         </w:tc>
@@ -1797,7 +1797,7 @@
                 <w:color w:val="000000"/>
                 <w:sz w:val="19"/>
               </w:rPr>
-              <w:t>0分</w:t>
+              <w:t>50分 / 2.75km</w:t>
             </w:r>
           </w:p>
         </w:tc>
@@ -1824,7 +1824,7 @@
                 <w:color w:val="000000"/>
                 <w:sz w:val="19"/>
               </w:rPr>
-              <w:t>❌ 未執行/待排程</w:t>
+              <w:t>🟢 良好達標 (83%, A-)</w:t>
             </w:r>
           </w:p>
         </w:tc>
@@ -3013,7 +3013,7 @@
     </w:p>
     <w:p>
       <w:r>
-        <w:t>• 當週累積自行車 0.00 km、跑步 8.40 km、游泳 0.00 km，整體時間執行率達 24.2%。</w:t>
+        <w:t>• 當週累積自行車 0.00 km、跑步 8.40 km、游泳 2.75 km，整體時間執行率達 44.7%。</w:t>
         <w:br/>
       </w:r>
       <w:r>

</xml_diff>